<commit_message>
More tweaks and fixes in Blessed by the Cougar.html
</commit_message>
<xml_diff>
--- a/Blessed by the Cougar.docx
+++ b/Blessed by the Cougar.docx
@@ -19,13 +19,7 @@
         <w:keepLines w:val="0"/>
       </w:pPr>
       <w:r>
-        <w:t>It was not until after that moment of recognition and pride passed across her great</w:t>
-      </w:r>
-      <w:r>
-        <w:t>-</w:t>
-      </w:r>
-      <w:r>
-        <w:t>grandmother’s face that she understood the gravity of what had happened. For years she had been trying to find her animal spirit. For six years she had searched for her totem</w:t>
+        <w:t>It was not until after that moment of recognition and pride passed across her great-grandmother’s face that she understood the gravity of what had happened. For years she had been trying to find her animal spirit. For six years she had searched for her totem</w:t>
       </w:r>
       <w:r>
         <w:t>, waiting for some sign, some whisper, some shape in the dark that would claim her.</w:t>
@@ -274,11 +268,9 @@
       <w:r>
         <w:t xml:space="preserve">She walked over to study the track. The ranger looked up and smiled and turned the sign toward </w:t>
       </w:r>
-      <w:proofErr w:type="gramStart"/>
       <w:r>
         <w:t>her</w:t>
       </w:r>
-      <w:proofErr w:type="gramEnd"/>
       <w:r>
         <w:t xml:space="preserve"> so she did not have to walk around the desk.</w:t>
       </w:r>
@@ -321,11 +313,9 @@
       <w:r>
         <w:t xml:space="preserve">Her fur was the color of golden sand. The same shade as the dunes she knew so </w:t>
       </w:r>
-      <w:proofErr w:type="gramStart"/>
       <w:r>
         <w:t>well</w:t>
       </w:r>
-      <w:proofErr w:type="gramEnd"/>
       <w:r>
         <w:t xml:space="preserve"> and the pits scattered across her grandfather’s ranch. Her paws were as big as both of </w:t>
       </w:r>
@@ -366,7 +356,19 @@
         <w:keepLines w:val="0"/>
       </w:pPr>
       <w:r>
-        <w:t>She gave her a slow blink. It was the same cat language she used with her grandmother’s cat. The cougar rose. She was slightly taller than the girl. Hoping she had not offended her</w:t>
+        <w:t xml:space="preserve">She gave her a slow blink. It was the same cat language she used with her grandmother’s cat. The cougar rose. </w:t>
+      </w:r>
+      <w:r>
+        <w:t>The cougar</w:t>
+      </w:r>
+      <w:r>
+        <w:t xml:space="preserve"> was slightly taller than </w:t>
+      </w:r>
+      <w:r>
+        <w:t>her</w:t>
+      </w:r>
+      <w:r>
+        <w:t>. Hoping she had not offended her</w:t>
       </w:r>
       <w:r>
         <w:t>,</w:t>
@@ -685,13 +687,7 @@
         <w:t>O</w:t>
       </w:r>
       <w:r>
-        <w:t xml:space="preserve">ne hand </w:t>
-      </w:r>
-      <w:r>
-        <w:t>was still</w:t>
-      </w:r>
-      <w:r>
-        <w:t xml:space="preserve"> wrapped around the leash</w:t>
+        <w:t>ne hand was still wrapped around the leash</w:t>
       </w:r>
       <w:r>
         <w:t xml:space="preserve">. The ranger’s </w:t>
@@ -733,7 +729,16 @@
         <w:t>her</w:t>
       </w:r>
       <w:r>
-        <w:t>s once more, slower this time, as if marking her. Claiming her</w:t>
+        <w:t>s once more, slower this time, as if marking her.</w:t>
+      </w:r>
+    </w:p>
+    <w:p>
+      <w:pPr>
+        <w:keepNext w:val="0"/>
+        <w:keepLines w:val="0"/>
+      </w:pPr>
+      <w:r>
+        <w:t>Claiming her</w:t>
       </w:r>
       <w:r>
         <w:t>.</w:t>
@@ -1505,6 +1510,7 @@
   <w:style w:type="character" w:default="1" w:styleId="DefaultParagraphFont">
     <w:name w:val="Default Paragraph Font"/>
     <w:uiPriority w:val="1"/>
+    <w:semiHidden/>
     <w:unhideWhenUsed/>
   </w:style>
   <w:style w:type="table" w:default="1" w:styleId="TableNormal">

</xml_diff>